<commit_message>
feat: add storcli RAID management and rename product to storman
- Agent: storcli controller/VD/PD/event queries; guarded create/delete/property ops
  (confirmation strings, argv-only exec, read-back checks); node-wide write guard
  allow_mutation=false; capability reporting; LIO-less nodes skip target sync
- Manager: live RAID proxy endpoints with read-only gating (403 RAID_READ_ONLY),
  audit, agent address fallback for cross-network nodes, 330s timeout
- Web: RAID page (controller/VD/PD/events, read-only banner, disabled actions),
  node capability panel, storman branding
- Deploy: storman package/install defaults (storman-manager/storman-agent),
  read-only agent docs; bundle storman-0.93
- Tests: RAID read-only/validation/parsing (agent) and manager gating; smoke 41/41
- Docs: README, 部署/开发文档, 使用手册 RAID 章节, RELEASE-0.93
</commit_message>
<xml_diff>
--- a/docs/使用手册.docx
+++ b/docs/使用手册.docx
@@ -70,7 +70,7 @@
                 <w:sz w:val="80"/>
                 <w:szCs w:val="80"/>
               </w:rPr>
-              <w:t xml:space="preserve">ZFS存储管理平台使用手册</w:t>
+              <w:t xml:space="preserve">storman 存储管理平台使用手册</w:t>
             </w:r>
           </w:p>
           <w:p>
@@ -157,7 +157,7 @@
                 <w:sz w:val="24"/>
                 <w:szCs w:val="24"/>
               </w:rPr>
-              <w:t xml:space="preserve">配套系统:ZFS 存储管理平台(Manager + Node Agent)</w:t>
+              <w:t xml:space="preserve">配套系统:storman 存储管理平台(Manager + Node Agent)</w:t>
             </w:r>
           </w:p>
           <w:p>
@@ -1630,7 +1630,7 @@
           <w:sz w:val="24"/>
           <w:szCs w:val="24"/>
         </w:rPr>
-        <w:t xml:space="preserve">ZFS 存储管理平台面向存储管理员,将多台基于 ZFS(OpenZFS ≥ 2.3)的存储节点纳入统一 Web 控制面,提供存储池、卷(zvol)与文件系统(dataset)、快照与克隆、iSCSI(LIO)目标与 LUN 映射、主机与访问控制(CHAP)、活动会话、审计与角色权限等管理能力,替代逐台登录服务器执行命令的运维方式。</w:t>
+        <w:t xml:space="preserve">storman 存储管理平台面向存储管理员,将多台基于 ZFS(OpenZFS ≥ 2.3)的存储节点纳入统一 Web 控制面,提供存储池、卷(zvol)与文件系统(dataset)、快照与克隆、iSCSI(LIO)目标与 LUN 映射、主机与访问控制(CHAP)、活动会话、审计与角色权限等管理能力,替代逐台登录服务器执行命令的运维方式。</w:t>
       </w:r>
     </w:p>
     <w:p>
@@ -6369,6 +6369,216 @@
           <w:szCs w:val="24"/>
         </w:rPr>
         <w:t xml:space="preserve">wwn-0x6001405… 与卷如何对应?该 WWN 即该卷 LIO backstore 的持久标识,目标详情 LUN 表直接显示,便于与客户端 /dev/disk/by-id 核对。</w:t>
+      </w:r>
+    </w:p>
+    <w:p>
+      <w:pPr>
+        <w:pStyle w:val="Heading1"/>
+      </w:pPr>
+      <w:r>
+        <w:rPr>
+          <w:rFonts w:ascii="Times New Roman" w:hAnsi="Times New Roman" w:eastAsia="Microsoft YaHei"/>
+          <w:sz w:val="30"/>
+        </w:rPr>
+        <w:t>10  RAID 管理</w:t>
+      </w:r>
+    </w:p>
+    <w:p>
+      <w:pPr>
+        <w:spacing w:line="312" w:lineRule="auto"/>
+        <w:ind w:firstLine="480"/>
+      </w:pPr>
+      <w:r>
+        <w:rPr>
+          <w:rFonts w:ascii="Times New Roman" w:hAnsi="Times New Roman" w:eastAsia="Microsoft YaHei"/>
+          <w:b w:val="0"/>
+          <w:sz w:val="24"/>
+        </w:rPr>
+        <w:t>RAID 页经节点 Agent 调用 storcli,统一展示控制器、虚拟磁盘(VD)、物理磁盘(PD)与 RAID 日志。仅检测到 storcli 与 RAID 控制器的节点会出现在节点下拉框中;控制器信息含型号、序列号、固件/BIOS、PCI/SAS 地址、驱动、端口与 PD/DG/VD 数量、BBU、告警、温度等。</w:t>
+      </w:r>
+    </w:p>
+    <w:p>
+      <w:pPr>
+        <w:spacing w:line="312" w:lineRule="auto"/>
+        <w:ind w:firstLine="480"/>
+      </w:pPr>
+      <w:r>
+        <w:rPr>
+          <w:rFonts w:ascii="Times New Roman" w:hAnsi="Times New Roman" w:eastAsia="Microsoft YaHei"/>
+          <w:b w:val="0"/>
+          <w:sz w:val="24"/>
+        </w:rPr>
+        <w:t>只读节点(生产/验证环境)顶部显示黄色提示条,创建/删除/属性按钮置灰;所有查询照常可用。</w:t>
+      </w:r>
+    </w:p>
+    <w:p>
+      <w:pPr>
+        <w:jc w:val="center"/>
+      </w:pPr>
+      <w:r>
+        <w:drawing>
+          <wp:inline xmlns:a="http://schemas.openxmlformats.org/drawingml/2006/main" xmlns:pic="http://schemas.openxmlformats.org/drawingml/2006/picture">
+            <wp:extent cx="5669280" cy="3188970"/>
+            <wp:docPr id="2" name="Picture 2"/>
+            <wp:cNvGraphicFramePr>
+              <a:graphicFrameLocks noChangeAspect="1"/>
+            </wp:cNvGraphicFramePr>
+            <a:graphic>
+              <a:graphicData uri="http://schemas.openxmlformats.org/drawingml/2006/picture">
+                <pic:pic>
+                  <pic:nvPicPr>
+                    <pic:cNvPr id="0" name="call_00_ET_3ULICZA2SUJjEPGfRJE93175-tool-result-e7b8433a-e6ec-44c8-8642-435dcdd6131d.png"/>
+                    <pic:cNvPicPr/>
+                  </pic:nvPicPr>
+                  <pic:blipFill>
+                    <a:blip r:embed="rId24"/>
+                    <a:stretch>
+                      <a:fillRect/>
+                    </a:stretch>
+                  </pic:blipFill>
+                  <pic:spPr>
+                    <a:xfrm>
+                      <a:off x="0" y="0"/>
+                      <a:ext cx="5669280" cy="3188970"/>
+                    </a:xfrm>
+                    <a:prstGeom prst="rect"/>
+                  </pic:spPr>
+                </pic:pic>
+              </a:graphicData>
+            </a:graphic>
+          </wp:inline>
+        </w:drawing>
+      </w:r>
+    </w:p>
+    <w:p>
+      <w:pPr>
+        <w:jc w:val="center"/>
+      </w:pPr>
+      <w:r>
+        <w:rPr>
+          <w:rFonts w:ascii="Times New Roman" w:hAnsi="Times New Roman"/>
+          <w:color w:val="606060"/>
+          <w:sz w:val="18"/>
+        </w:rPr>
+        <w:t>图 15  RAID 管理(只读生产节点)</w:t>
+      </w:r>
+    </w:p>
+    <w:p>
+      <w:pPr>
+        <w:pStyle w:val="Heading2"/>
+      </w:pPr>
+      <w:r>
+        <w:rPr>
+          <w:rFonts w:ascii="Times New Roman" w:hAnsi="Times New Roman" w:eastAsia="Microsoft YaHei"/>
+          <w:sz w:val="26"/>
+        </w:rPr>
+        <w:t>10.1  虚拟磁盘与物理磁盘</w:t>
+      </w:r>
+    </w:p>
+    <w:p>
+      <w:pPr>
+        <w:spacing w:line="312" w:lineRule="auto"/>
+        <w:ind w:firstLine="480"/>
+      </w:pPr>
+      <w:r>
+        <w:rPr>
+          <w:rFonts w:ascii="Times New Roman" w:hAnsi="Times New Roman" w:eastAsia="Microsoft YaHei"/>
+          <w:b w:val="0"/>
+          <w:sz w:val="24"/>
+        </w:rPr>
+        <w:t>「虚拟磁盘 VD」列出 VD/DG、RAID 级别、状态、容量、访问/缓存策略与一致性;「物理磁盘 PD」列出 EID:Slt、状态、DG、容量、接口、介质、扇区、型号、热备与 SED。可写节点上可点击「属性」修改 VD 名称、WT/WB 写策略、读策略、Direct/Cached IO 策略与 RW/RO 访问策略。</w:t>
+      </w:r>
+    </w:p>
+    <w:p>
+      <w:pPr>
+        <w:pStyle w:val="Heading2"/>
+      </w:pPr>
+      <w:r>
+        <w:rPr>
+          <w:rFonts w:ascii="Times New Roman" w:hAnsi="Times New Roman" w:eastAsia="Microsoft YaHei"/>
+          <w:sz w:val="26"/>
+        </w:rPr>
+        <w:t>10.2  创建与删除(仅可写节点)</w:t>
+      </w:r>
+    </w:p>
+    <w:p>
+      <w:pPr>
+        <w:spacing w:line="312" w:lineRule="auto"/>
+        <w:ind w:firstLine="480"/>
+      </w:pPr>
+      <w:r>
+        <w:rPr>
+          <w:rFonts w:ascii="Times New Roman" w:hAnsi="Times New Roman" w:eastAsia="Microsoft YaHei"/>
+          <w:b w:val="0"/>
+          <w:sz w:val="24"/>
+        </w:rPr>
+        <w:t>创建 RAID 组:选择 RAID 0/1/5/6/10/50/60,勾选物理磁盘(EID:Slt,勿选已入组磁盘),可选名称(≤15 位)、条带大小与每阵列磁盘数,并键入确认串 CREATE &lt;名称或级别&gt;。创建会清空所选磁盘数据。</w:t>
+      </w:r>
+    </w:p>
+    <w:p>
+      <w:pPr>
+        <w:spacing w:line="312" w:lineRule="auto"/>
+        <w:ind w:firstLine="480"/>
+      </w:pPr>
+      <w:r>
+        <w:rPr>
+          <w:rFonts w:ascii="Times New Roman" w:hAnsi="Times New Roman" w:eastAsia="Microsoft YaHei"/>
+          <w:b w:val="0"/>
+          <w:sz w:val="24"/>
+        </w:rPr>
+        <w:t>删除 RAID 组:需在弹出的确认框中键入 VD&lt;编号&gt;;删除后平台回读 VD 列表确认已消失。所有写操作在 Manager 审计留痕。</w:t>
+      </w:r>
+    </w:p>
+    <w:p>
+      <w:pPr>
+        <w:pStyle w:val="Heading2"/>
+      </w:pPr>
+      <w:r>
+        <w:rPr>
+          <w:rFonts w:ascii="Times New Roman" w:hAnsi="Times New Roman" w:eastAsia="Microsoft YaHei"/>
+          <w:sz w:val="26"/>
+        </w:rPr>
+        <w:t>10.3  RAID 日志</w:t>
+      </w:r>
+    </w:p>
+    <w:p>
+      <w:pPr>
+        <w:spacing w:line="312" w:lineRule="auto"/>
+        <w:ind w:firstLine="480"/>
+      </w:pPr>
+      <w:r>
+        <w:rPr>
+          <w:rFonts w:ascii="Times New Roman" w:hAnsi="Times New Roman" w:eastAsia="Microsoft YaHei"/>
+          <w:b w:val="0"/>
+          <w:sz w:val="24"/>
+        </w:rPr>
+        <w:t>日志页显示事件总数与最近 50/100/200 条,按序号、时间(无绝对时间时显示“启动后 N 秒”)与事件描述列表展示;展开行可查看 storcli 原始记录。</w:t>
+      </w:r>
+    </w:p>
+    <w:p>
+      <w:pPr>
+        <w:pStyle w:val="Heading2"/>
+      </w:pPr>
+      <w:r>
+        <w:rPr>
+          <w:rFonts w:ascii="Times New Roman" w:hAnsi="Times New Roman" w:eastAsia="Microsoft YaHei"/>
+          <w:sz w:val="26"/>
+        </w:rPr>
+        <w:t>10.4  只读模式与生产保护</w:t>
+      </w:r>
+    </w:p>
+    <w:p>
+      <w:pPr>
+        <w:spacing w:line="312" w:lineRule="auto"/>
+        <w:ind w:firstLine="480"/>
+      </w:pPr>
+      <w:r>
+        <w:rPr>
+          <w:rFonts w:ascii="Times New Roman" w:hAnsi="Times New Roman" w:eastAsia="Microsoft YaHei"/>
+          <w:b w:val="0"/>
+          <w:sz w:val="24"/>
+        </w:rPr>
+        <w:t>在节点 /etc/storman/agent.toml 设置 allow_mutation = false 可禁止该节点全部 ZFS/RAID 变更;raid_allow_mutation = false(默认)单独禁用 RAID 写操作。Manager 对只读节点的 RAID 写请求直接返回 403,Agent 亦在执行前返回 READ_ONLY,形成双端保护。生产环境请保持只读,写操作验收应在独立测试节点进行。</w:t>
       </w:r>
     </w:p>
     <w:p>

</xml_diff>

<commit_message>
feat: RAID log pagination, pool disk view, HW fields and password unlock
- Agent: read controller BBU/temperature/memory/ECC from storcli show all HwCfg/Status;
  paginate RAID events server-side (10-200/page); node-wide in-memory unlock window with
  TTL auto-relock; mutation state query
- Manager: mutation state/unlock/lock APIs (admin password re-auth, rate-limited, audited
  with password redaction); dynamic RAID write gate; event page params; agent fallback
- Web: RAID unlock dialog/remaining TTL/relock; pagination controls; corrected hardware
  display; pools expand shows associated disks with vdev group and errors
- Docs: v0.94 README/deploy/dev docs and release notes; manual RAID sections
- Tests: agent 17 passed; manager go test/vet; smoke 41/41; TTL auto-relock verified
</commit_message>
<xml_diff>
--- a/docs/使用手册.docx
+++ b/docs/使用手册.docx
@@ -6488,6 +6488,13 @@
         </w:rPr>
         <w:t>「虚拟磁盘 VD」列出 VD/DG、RAID 级别、状态、容量、访问/缓存策略与一致性;「物理磁盘 PD」列出 EID:Slt、状态、DG、容量、接口、介质、扇区、型号、热备与 SED。可写节点上可点击「属性」修改 VD 名称、WT/WB 写策略、读策略、Direct/Cached IO 策略与 RW/RO 访问策略。</w:t>
       </w:r>
+      <w:r>
+        <w:rPr>
+          <w:rFonts w:ascii="Times New Roman" w:hAnsi="Times New Roman" w:eastAsia="Microsoft YaHei"/>
+          <w:sz w:val="24"/>
+        </w:rPr>
+        <w:t xml:space="preserve"> 控制器硬件信息(BBU、温度、内存/ECC)读取 storcli 的 HwCfg/Status 段;BBU 未配置时显示「缺失(未配置)」,温度显示为摄氏度。</w:t>
+      </w:r>
     </w:p>
     <w:p>
       <w:pPr>
@@ -6579,6 +6586,82 @@
           <w:sz w:val="24"/>
         </w:rPr>
         <w:t>在节点 /etc/storman/agent.toml 设置 allow_mutation = false 可禁止该节点全部 ZFS/RAID 变更;raid_allow_mutation = false(默认)单独禁用 RAID 写操作。Manager 对只读节点的 RAID 写请求直接返回 403,Agent 亦在执行前返回 READ_ONLY,形成双端保护。生产环境请保持只读,写操作验收应在独立测试节点进行。</w:t>
+      </w:r>
+    </w:p>
+    <w:p>
+      <w:pPr>
+        <w:pStyle w:val="Heading2"/>
+      </w:pPr>
+      <w:r>
+        <w:rPr>
+          <w:rFonts w:ascii="Times New Roman" w:hAnsi="Times New Roman" w:eastAsia="Microsoft YaHei"/>
+          <w:sz w:val="26"/>
+        </w:rPr>
+        <w:t>10.5  临时解锁写操作(仅管理员)</w:t>
+      </w:r>
+    </w:p>
+    <w:p>
+      <w:pPr>
+        <w:spacing w:line="312" w:lineRule="auto"/>
+        <w:ind w:firstLine="480"/>
+      </w:pPr>
+      <w:r>
+        <w:rPr>
+          <w:rFonts w:ascii="Times New Roman" w:hAnsi="Times New Roman" w:eastAsia="Microsoft YaHei"/>
+          <w:sz w:val="24"/>
+        </w:rPr>
+        <w:t>只读节点顶部显示「输入密码临时解锁」。点击后输入当前登录账号的口令,选择 5/15/30/60 分钟:Manager 重新校验口令(错误计入限速),通过后通知 Agent 在内存中临时放开该节点的 ZFS/RAID 写操作。解锁期间页面显示剩余时间与「立即回锁」按钮;到期、点击回锁或 Agent 重启都会恢复只读。解锁/回锁均写入审计,口令不会以明文保存。</w:t>
+      </w:r>
+    </w:p>
+    <w:p>
+      <w:pPr>
+        <w:spacing w:line="312" w:lineRule="auto"/>
+        <w:ind w:firstLine="480"/>
+      </w:pPr>
+      <w:r>
+        <w:rPr>
+          <w:rFonts w:ascii="Times New Roman" w:hAnsi="Times New Roman" w:eastAsia="Microsoft YaHei"/>
+          <w:sz w:val="24"/>
+        </w:rPr>
+        <w:t>注意:解锁是节点级权限,会同时放开 ZFS 与 RAID 写操作;临时解锁不会修改 agent.toml 配置。生产环境使用后建议立即回锁。</w:t>
+      </w:r>
+    </w:p>
+    <w:p>
+      <w:pPr>
+        <w:pStyle w:val="Heading2"/>
+      </w:pPr>
+      <w:r>
+        <w:rPr>
+          <w:rFonts w:ascii="Times New Roman" w:hAnsi="Times New Roman" w:eastAsia="Microsoft YaHei"/>
+          <w:sz w:val="26"/>
+        </w:rPr>
+        <w:t>10.6  日志分页与关联磁盘</w:t>
+      </w:r>
+    </w:p>
+    <w:p>
+      <w:pPr>
+        <w:spacing w:line="312" w:lineRule="auto"/>
+        <w:ind w:firstLine="480"/>
+      </w:pPr>
+      <w:r>
+        <w:rPr>
+          <w:rFonts w:ascii="Times New Roman" w:hAnsi="Times New Roman" w:eastAsia="Microsoft YaHei"/>
+          <w:sz w:val="24"/>
+        </w:rPr>
+        <w:t>RAID 日志按页显示:可切换每页 50/100/200 条,使用页码、上一页/下一页或跳页浏览;展开任意行可查看 storcli 原始事件。</w:t>
+      </w:r>
+    </w:p>
+    <w:p>
+      <w:pPr>
+        <w:spacing w:line="312" w:lineRule="auto"/>
+        <w:ind w:firstLine="480"/>
+      </w:pPr>
+      <w:r>
+        <w:rPr>
+          <w:rFonts w:ascii="Times New Roman" w:hAnsi="Times New Roman" w:eastAsia="Microsoft YaHei"/>
+          <w:sz w:val="24"/>
+        </w:rPr>
+        <w:t>存储池页面点击池行左侧展开箭头,可在「池内卷 / 数据集」下方看到「关联磁盘」:设备名、所属 vdev、状态、设备路径、容量以及读/写/校验错误;数据来自 zpool status 的 vdev 叶节点。</w:t>
       </w:r>
     </w:p>
     <w:p>

</xml_diff>

<commit_message>
feat: show node OS/CPU/memory/RAID/disks/HBA inventory
- Agent 0.4.0: hardware query collects OS/kernel/arch/hostname/uptime, CPU model and
  core topology, memory/swap, physical disks (model/serial/WWN/media/mounts) and
  FC/SAS/SCSI HBA ports/adapters; excludes zvol/nbd/loop pseudo disks
- Manager: GET /nodes/{id}/hardware live proxy
- Web: node detail drawer shows system, CPU, memory, RAID card, disks and HBA;
  official OS logos for Debian/openEuler/Ubuntu/CentOS/Fedora/RHEL/Alma/Rocky/SUSE
- Tests: 19 agent tests incl. hardware inventory; docs/version 0.95
</commit_message>
<xml_diff>
--- a/docs/使用手册.docx
+++ b/docs/使用手册.docx
@@ -5322,6 +5322,96 @@
           <w:szCs w:val="21"/>
         </w:rPr>
         <w:t xml:space="preserve">图 6-3  节点详情-能力探测(结构化展示)</w:t>
+      </w:r>
+    </w:p>
+    <w:p>
+      <w:pPr>
+        <w:pStyle w:val="Heading2"/>
+      </w:pPr>
+      <w:r>
+        <w:rPr>
+          <w:rFonts w:ascii="Times New Roman" w:hAnsi="Times New Roman" w:eastAsia="Microsoft YaHei"/>
+          <w:sz w:val="26"/>
+        </w:rPr>
+        <w:t>6.5  节点硬件信息</w:t>
+      </w:r>
+    </w:p>
+    <w:p>
+      <w:pPr>
+        <w:spacing w:line="312" w:lineRule="auto"/>
+        <w:ind w:firstLine="480"/>
+      </w:pPr>
+      <w:r>
+        <w:rPr>
+          <w:rFonts w:ascii="Times New Roman" w:hAnsi="Times New Roman" w:eastAsia="Microsoft YaHei"/>
+          <w:sz w:val="24"/>
+        </w:rPr>
+        <w:t>节点页点击「详情」打开硬件面板,按系统、CPU、内存、RAID 卡、磁盘、HBA 顺序展示实时采集信息;右上角「刷新硬件」可重新采集。</w:t>
+      </w:r>
+    </w:p>
+    <w:p>
+      <w:pPr>
+        <w:spacing w:line="312" w:lineRule="auto"/>
+        <w:ind w:firstLine="480"/>
+      </w:pPr>
+      <w:r>
+        <w:rPr>
+          <w:rFonts w:ascii="Times New Roman" w:hAnsi="Times New Roman" w:eastAsia="Microsoft YaHei"/>
+          <w:sz w:val="24"/>
+        </w:rPr>
+        <w:t>系统:操作系统名称与版本(左侧显示发行版官方图标)、内核/架构、主机名、运行时间、Agent 版本、ZFS 版本与最后心跳。</w:t>
+      </w:r>
+    </w:p>
+    <w:p>
+      <w:pPr>
+        <w:spacing w:line="312" w:lineRule="auto"/>
+        <w:ind w:firstLine="480"/>
+      </w:pPr>
+      <w:r>
+        <w:rPr>
+          <w:rFonts w:ascii="Times New Roman" w:hAnsi="Times New Roman" w:eastAsia="Microsoft YaHei"/>
+          <w:sz w:val="24"/>
+        </w:rPr>
+        <w:t>CPU:型号、逻辑处理器、物理核心、插槽数/每插槽核心与当前平均主频。内存:已用/总量使用率、可用/空闲及交换分区。</w:t>
+      </w:r>
+    </w:p>
+    <w:p>
+      <w:pPr>
+        <w:spacing w:line="312" w:lineRule="auto"/>
+        <w:ind w:firstLine="480"/>
+      </w:pPr>
+      <w:r>
+        <w:rPr>
+          <w:rFonts w:ascii="Times New Roman" w:hAnsi="Times New Roman" w:eastAsia="Microsoft YaHei"/>
+          <w:sz w:val="24"/>
+        </w:rPr>
+        <w:t>RAID 卡:型号、序列号、固件、健康、BBU、温度、内存与 PD/DG/VD 数量;可点击「管理 RAID」跳转 RAID 页。</w:t>
+      </w:r>
+    </w:p>
+    <w:p>
+      <w:pPr>
+        <w:spacing w:line="312" w:lineRule="auto"/>
+        <w:ind w:firstLine="480"/>
+      </w:pPr>
+      <w:r>
+        <w:rPr>
+          <w:rFonts w:ascii="Times New Roman" w:hAnsi="Times New Roman" w:eastAsia="Microsoft YaHei"/>
+          <w:sz w:val="24"/>
+        </w:rPr>
+        <w:t>磁盘:设备名、容量、型号、序列号、WWN、接口/介质、文件系统、挂载点与分区数;仅显示物理整盘,不包含 zvol、nbd、loop 等虚拟块设备。</w:t>
+      </w:r>
+    </w:p>
+    <w:p>
+      <w:pPr>
+        <w:spacing w:line="312" w:lineRule="auto"/>
+        <w:ind w:firstLine="480"/>
+      </w:pPr>
+      <w:r>
+        <w:rPr>
+          <w:rFonts w:ascii="Times New Roman" w:hAnsi="Times New Roman" w:eastAsia="Microsoft YaHei"/>
+          <w:sz w:val="24"/>
+        </w:rPr>
+        <w:t>HBA:FC 端口显示 WWPN/WWNN/状态/速率/驱动;PCI 存储控制器显示 PCI 地址、类型、描述与驱动。未检测到 FC/SAS HBA 时给出提示(RAID 卡在独立区域展示)。</w:t>
       </w:r>
     </w:p>
     <w:p>

</xml_diff>